<commit_message>
Expand theory and program explanations in lab reports
</commit_message>
<xml_diff>
--- a/З_И/Лабораторная_работа_1_Подстановка.docx
+++ b/З_И/Лабораторная_работа_1_Подстановка.docx
@@ -221,6 +221,70 @@
           <w:sz w:val="26"/>
         </w:rPr>
         <w:t>Вариант №10: V = {а, б, в, г, д, е}, длина блока m = 2. Число возможных блоков равно 6² = 36. Для функции подстановки выбрана формула CV(x) = (5x + 7) mod 36. Она взаимно однозначна, поскольку НОД(5, 36) = 1.</w:t>
+      </w:r>
+    </w:p>
+    <w:p>
+      <w:pPr>
+        <w:keepNext/>
+        <w:spacing w:line="360" w:lineRule="auto" w:before="80" w:after="80"/>
+        <w:jc w:val="left"/>
+      </w:pPr>
+      <w:r>
+        <w:rPr>
+          <w:rFonts w:ascii="Times New Roman" w:hAnsi="Times New Roman" w:eastAsia="Times New Roman"/>
+          <w:b/>
+          <w:i w:val="0"/>
+          <w:sz w:val="26"/>
+        </w:rPr>
+        <w:t>Краткие теоретические сведения</w:t>
+      </w:r>
+    </w:p>
+    <w:p>
+      <w:pPr>
+        <w:spacing w:line="360" w:lineRule="auto" w:after="0"/>
+        <w:ind w:firstLine="709"/>
+        <w:jc w:val="both"/>
+      </w:pPr>
+      <w:r>
+        <w:rPr>
+          <w:rFonts w:ascii="Times New Roman" w:hAnsi="Times New Roman" w:eastAsia="Times New Roman"/>
+          <w:b w:val="0"/>
+          <w:i w:val="0"/>
+          <w:sz w:val="26"/>
+        </w:rPr>
+        <w:t>Подстановочное шифрование относится к симметричным методам: отправитель и получатель используют один и тот же секретный ключ. Открытый текст разбивается на блоки фиксированной длины, а каждому допустимому блоку ставится в соответствие другой блок того же размера. Если соответствие является взаимно однозначным, зашифрованный блок можно восстановить единственным способом.</w:t>
+      </w:r>
+    </w:p>
+    <w:p>
+      <w:pPr>
+        <w:spacing w:line="360" w:lineRule="auto" w:after="0"/>
+        <w:ind w:firstLine="709"/>
+        <w:jc w:val="both"/>
+      </w:pPr>
+      <w:r>
+        <w:rPr>
+          <w:rFonts w:ascii="Times New Roman" w:hAnsi="Times New Roman" w:eastAsia="Times New Roman"/>
+          <w:b w:val="0"/>
+          <w:i w:val="0"/>
+          <w:sz w:val="26"/>
+        </w:rPr>
+        <w:t>В варианте №10 алфавит содержит шесть символов. Поэтому двухсимвольный блок можно рассматривать как число в диапазоне от 0 до 35: первый символ задаёт разряд шестёрок, второй — разряд единиц. Всего существует 6² = 36 комбинаций, и функция CV должна переставлять все эти комбинации без повторений и пропусков.</w:t>
+      </w:r>
+    </w:p>
+    <w:p>
+      <w:pPr>
+        <w:spacing w:line="360" w:lineRule="auto" w:after="0"/>
+        <w:ind w:firstLine="709"/>
+        <w:jc w:val="both"/>
+      </w:pPr>
+      <w:r>
+        <w:rPr>
+          <w:rFonts w:ascii="Times New Roman" w:hAnsi="Times New Roman" w:eastAsia="Times New Roman"/>
+          <w:b w:val="0"/>
+          <w:i w:val="0"/>
+          <w:sz w:val="26"/>
+        </w:rPr>
+        <w:t>В работе используется аффинная подстановка CV(x) = (ax + b) mod 36. Такая функция будет обратимой, если множитель a взаимно прост с модулем 36. Для a = 5 это условие выполняется. Обратное преобразование использует число 29, потому что 5·29 = 145 ≡ 1 (mod 36). Символ «а» применяется только как заполнитель неполного последнего блока; его добавленная длина хранится отдельно.</w:t>
       </w:r>
     </w:p>
     <w:p>
@@ -1413,7 +1477,7 @@
           <w:i w:val="0"/>
           <w:sz w:val="26"/>
         </w:rPr>
-        <w:t>Краткое объяснение программы</w:t>
+        <w:t>Полное объяснение программы</w:t>
       </w:r>
     </w:p>
     <w:p>
@@ -1429,7 +1493,71 @@
           <w:i w:val="0"/>
           <w:sz w:val="26"/>
         </w:rPr>
-        <w:t>Функция encrypt проверяет принадлежность символов заданному алфавиту, разбивает строку на пары, переводит каждую пару в число от 0 до 35 и применяет аффинную подстановку. Функция decrypt использует обратный множитель 29 и возвращает исходную длину, удаляя только добавленный символ заполнения. Параметры A и B являются ключом функции подстановки.</w:t>
+        <w:t>Константа ALPHABET задаёт порядок символов варианта. Этот порядок важен: индекс символа в строке используется как его числовое значение от 0 до 5. BLOCK_SIZE равен двум, BASE равен шести, а MODULUS вычисляется как 6² и задаёт количество возможных блоков.</w:t>
+      </w:r>
+    </w:p>
+    <w:p>
+      <w:pPr>
+        <w:spacing w:line="360" w:lineRule="auto" w:after="0"/>
+        <w:ind w:firstLine="709"/>
+        <w:jc w:val="both"/>
+      </w:pPr>
+      <w:r>
+        <w:rPr>
+          <w:rFonts w:ascii="Times New Roman" w:hAnsi="Times New Roman" w:eastAsia="Times New Roman"/>
+          <w:b w:val="0"/>
+          <w:i w:val="0"/>
+          <w:sz w:val="26"/>
+        </w:rPr>
+        <w:t>Функция _block_to_number переводит пару символов в число по основанию 6. Сначала накапливается значение первого символа, затем оно умножается на 6 и к нему прибавляется индекс второго символа. Обратная функция _number_to_block выполняет деление числа на 6 с остатком и получает два индекса; разворот списка восстанавливает правильный порядок символов.</w:t>
+      </w:r>
+    </w:p>
+    <w:p>
+      <w:pPr>
+        <w:spacing w:line="360" w:lineRule="auto" w:after="0"/>
+        <w:ind w:firstLine="709"/>
+        <w:jc w:val="both"/>
+      </w:pPr>
+      <w:r>
+        <w:rPr>
+          <w:rFonts w:ascii="Times New Roman" w:hAnsi="Times New Roman" w:eastAsia="Times New Roman"/>
+          <w:b w:val="0"/>
+          <w:i w:val="0"/>
+          <w:sz w:val="26"/>
+        </w:rPr>
+        <w:t>Функция encrypt сначала проверяет каждый входной символ. Это предотвращает неоднозначность, потому что символы вне алфавита не имеют индекса в таблице подстановки. Затем вычисляется исходная длина, добавляется необходимое число символов «а», а каждый блок переводится в число x и преобразуется по формуле (5x + 7) mod 36.</w:t>
+      </w:r>
+    </w:p>
+    <w:p>
+      <w:pPr>
+        <w:spacing w:line="360" w:lineRule="auto" w:after="0"/>
+        <w:ind w:firstLine="709"/>
+        <w:jc w:val="both"/>
+      </w:pPr>
+      <w:r>
+        <w:rPr>
+          <w:rFonts w:ascii="Times New Roman" w:hAnsi="Times New Roman" w:eastAsia="Times New Roman"/>
+          <w:b w:val="0"/>
+          <w:i w:val="0"/>
+          <w:sz w:val="26"/>
+        </w:rPr>
+        <w:t>Функция decrypt принимает шифртекст и исходную длину. Для каждого блока она получает число y, вычитает свободный член 7 и умножает результат на обратный множитель 29 по модулю 36. После обратного преобразования пары объединяются, а срез [:original_length] удаляет только символы заполнения, не затрагивая реальные символы исходного текста.</w:t>
+      </w:r>
+    </w:p>
+    <w:p>
+      <w:pPr>
+        <w:spacing w:line="360" w:lineRule="auto" w:after="0"/>
+        <w:ind w:firstLine="709"/>
+        <w:jc w:val="both"/>
+      </w:pPr>
+      <w:r>
+        <w:rPr>
+          <w:rFonts w:ascii="Times New Roman" w:hAnsi="Times New Roman" w:eastAsia="Times New Roman"/>
+          <w:b w:val="0"/>
+          <w:i w:val="0"/>
+          <w:sz w:val="26"/>
+        </w:rPr>
+        <w:t>В блоке if __name__ == '__main__' программа запрашивает сообщение, вызывает encrypt, выводит шифрограмму, а затем немедленно выполняет decrypt. Такая проверка показывает, что выбранная функция действительно обратима и что весь цикл обработки данных работает последовательно.</w:t>
       </w:r>
     </w:p>
     <w:p>

</xml_diff>

<commit_message>
Set report body font to 14pt and code to 11pt
</commit_message>
<xml_diff>
--- a/З_И/Лабораторная_работа_1_Подстановка.docx
+++ b/З_И/Лабораторная_работа_1_Подстановка.docx
@@ -99,7 +99,7 @@
           <w:rFonts w:ascii="Times New Roman" w:hAnsi="Times New Roman" w:eastAsia="Times New Roman"/>
           <w:b w:val="0"/>
           <w:i w:val="0"/>
-          <w:sz w:val="26"/>
+          <w:sz w:val="28"/>
         </w:rPr>
         <w:t>Выполнил(а): студент(ка) группы __________</w:t>
         <w:br/>
@@ -133,7 +133,7 @@
           <w:rFonts w:ascii="Times New Roman" w:hAnsi="Times New Roman" w:eastAsia="Times New Roman"/>
           <w:b w:val="0"/>
           <w:i w:val="0"/>
-          <w:sz w:val="26"/>
+          <w:sz w:val="28"/>
         </w:rPr>
         <w:t>2026</w:t>
       </w:r>
@@ -154,7 +154,7 @@
           <w:rFonts w:ascii="Times New Roman" w:hAnsi="Times New Roman" w:eastAsia="Times New Roman"/>
           <w:b/>
           <w:i w:val="0"/>
-          <w:sz w:val="26"/>
+          <w:sz w:val="28"/>
         </w:rPr>
         <w:t>Лабораторная работа №1 «Шифрование данных методом подстановки»</w:t>
       </w:r>
@@ -170,7 +170,7 @@
           <w:rFonts w:ascii="Times New Roman" w:hAnsi="Times New Roman" w:eastAsia="Times New Roman"/>
           <w:b/>
           <w:i w:val="0"/>
-          <w:sz w:val="26"/>
+          <w:sz w:val="28"/>
         </w:rPr>
         <w:t>1. Цель работы</w:t>
       </w:r>
@@ -186,7 +186,7 @@
           <w:rFonts w:ascii="Times New Roman" w:hAnsi="Times New Roman" w:eastAsia="Times New Roman"/>
           <w:b w:val="0"/>
           <w:i w:val="0"/>
-          <w:sz w:val="26"/>
+          <w:sz w:val="28"/>
         </w:rPr>
         <w:t>Изучить классический криптографический алгоритм подстановки, построить взаимно однозначную функцию для пар символов заданного алфавита и проверить обратное преобразование на программном примере.</w:t>
       </w:r>
@@ -202,7 +202,7 @@
           <w:rFonts w:ascii="Times New Roman" w:hAnsi="Times New Roman" w:eastAsia="Times New Roman"/>
           <w:b/>
           <w:i w:val="0"/>
-          <w:sz w:val="26"/>
+          <w:sz w:val="28"/>
         </w:rPr>
         <w:t>2. Индивидуальное задание</w:t>
       </w:r>
@@ -218,7 +218,7 @@
           <w:rFonts w:ascii="Times New Roman" w:hAnsi="Times New Roman" w:eastAsia="Times New Roman"/>
           <w:b w:val="0"/>
           <w:i w:val="0"/>
-          <w:sz w:val="26"/>
+          <w:sz w:val="28"/>
         </w:rPr>
         <w:t>Вариант №10: V = {а, б, в, г, д, е}, длина блока m = 2. Число возможных блоков равно 6² = 36. Для функции подстановки выбрана формула CV(x) = (5x + 7) mod 36. Она взаимно однозначна, поскольку НОД(5, 36) = 1.</w:t>
       </w:r>
@@ -234,7 +234,7 @@
           <w:rFonts w:ascii="Times New Roman" w:hAnsi="Times New Roman" w:eastAsia="Times New Roman"/>
           <w:b/>
           <w:i w:val="0"/>
-          <w:sz w:val="26"/>
+          <w:sz w:val="28"/>
         </w:rPr>
         <w:t>Краткие теоретические сведения</w:t>
       </w:r>
@@ -250,7 +250,7 @@
           <w:rFonts w:ascii="Times New Roman" w:hAnsi="Times New Roman" w:eastAsia="Times New Roman"/>
           <w:b w:val="0"/>
           <w:i w:val="0"/>
-          <w:sz w:val="26"/>
+          <w:sz w:val="28"/>
         </w:rPr>
         <w:t>Подстановочное шифрование относится к симметричным методам: отправитель и получатель используют один и тот же секретный ключ. Открытый текст разбивается на блоки фиксированной длины, а каждому допустимому блоку ставится в соответствие другой блок того же размера. Если соответствие является взаимно однозначным, зашифрованный блок можно восстановить единственным способом.</w:t>
       </w:r>
@@ -266,7 +266,7 @@
           <w:rFonts w:ascii="Times New Roman" w:hAnsi="Times New Roman" w:eastAsia="Times New Roman"/>
           <w:b w:val="0"/>
           <w:i w:val="0"/>
-          <w:sz w:val="26"/>
+          <w:sz w:val="28"/>
         </w:rPr>
         <w:t>В варианте №10 алфавит содержит шесть символов. Поэтому двухсимвольный блок можно рассматривать как число в диапазоне от 0 до 35: первый символ задаёт разряд шестёрок, второй — разряд единиц. Всего существует 6² = 36 комбинаций, и функция CV должна переставлять все эти комбинации без повторений и пропусков.</w:t>
       </w:r>
@@ -282,7 +282,7 @@
           <w:rFonts w:ascii="Times New Roman" w:hAnsi="Times New Roman" w:eastAsia="Times New Roman"/>
           <w:b w:val="0"/>
           <w:i w:val="0"/>
-          <w:sz w:val="26"/>
+          <w:sz w:val="28"/>
         </w:rPr>
         <w:t>В работе используется аффинная подстановка CV(x) = (ax + b) mod 36. Такая функция будет обратимой, если множитель a взаимно прост с модулем 36. Для a = 5 это условие выполняется. Обратное преобразование использует число 29, потому что 5·29 = 145 ≡ 1 (mod 36). Символ «а» применяется только как заполнитель неполного последнего блока; его добавленная длина хранится отдельно.</w:t>
       </w:r>
@@ -298,7 +298,7 @@
           <w:rFonts w:ascii="Times New Roman" w:hAnsi="Times New Roman" w:eastAsia="Times New Roman"/>
           <w:b/>
           <w:i w:val="0"/>
-          <w:sz w:val="26"/>
+          <w:sz w:val="28"/>
         </w:rPr>
         <w:t>3. Функция шифрования</w:t>
       </w:r>
@@ -314,7 +314,7 @@
           <w:rFonts w:ascii="Times New Roman" w:hAnsi="Times New Roman" w:eastAsia="Times New Roman"/>
           <w:b w:val="0"/>
           <w:i w:val="0"/>
-          <w:sz w:val="26"/>
+          <w:sz w:val="28"/>
         </w:rPr>
         <w:t>Текст варианта состоит из символов алфавита V = {а, б, в, г, д, е} и разбивается на блоки по два символа. Пара символов кодируется числом x от 0 до 35 в системе счисления по основанию 6. Затем вычисляется y = (5x + 7) mod 36, а число y снова представляется парой символов. Для дешифрования используется обратная функция x = 29(y − 7) mod 36. Неполный последний блок дополняется символом «а», а исходная длина сохраняется отдельно.</w:t>
       </w:r>
@@ -346,7 +346,7 @@
                 <w:rFonts w:ascii="Times New Roman" w:hAnsi="Times New Roman" w:eastAsia="Times New Roman"/>
                 <w:b/>
                 <w:i w:val="0"/>
-                <w:sz w:val="22"/>
+                <w:sz w:val="28"/>
               </w:rPr>
               <w:t>Параметр</w:t>
             </w:r>
@@ -368,7 +368,7 @@
                 <w:rFonts w:ascii="Times New Roman" w:hAnsi="Times New Roman" w:eastAsia="Times New Roman"/>
                 <w:b/>
                 <w:i w:val="0"/>
-                <w:sz w:val="22"/>
+                <w:sz w:val="28"/>
               </w:rPr>
               <w:t>Значение</w:t>
             </w:r>
@@ -563,7 +563,7 @@
           <w:rFonts w:ascii="Times New Roman" w:hAnsi="Times New Roman" w:eastAsia="Times New Roman"/>
           <w:b/>
           <w:i w:val="0"/>
-          <w:sz w:val="26"/>
+          <w:sz w:val="28"/>
         </w:rPr>
         <w:t>4. Текст программы</w:t>
       </w:r>
@@ -579,7 +579,7 @@
           <w:rFonts w:ascii="Consolas" w:hAnsi="Consolas" w:eastAsia="Consolas"/>
           <w:b w:val="0"/>
           <w:i w:val="0"/>
-          <w:sz w:val="18"/>
+          <w:sz w:val="22"/>
         </w:rPr>
         <w:t xml:space="preserve"> </w:t>
       </w:r>
@@ -595,7 +595,7 @@
           <w:rFonts w:ascii="Consolas" w:hAnsi="Consolas" w:eastAsia="Consolas"/>
           <w:b w:val="0"/>
           <w:i w:val="0"/>
-          <w:sz w:val="18"/>
+          <w:sz w:val="22"/>
         </w:rPr>
         <w:t>from typing import Tuple</w:t>
       </w:r>
@@ -611,7 +611,7 @@
           <w:rFonts w:ascii="Consolas" w:hAnsi="Consolas" w:eastAsia="Consolas"/>
           <w:b w:val="0"/>
           <w:i w:val="0"/>
-          <w:sz w:val="18"/>
+          <w:sz w:val="22"/>
         </w:rPr>
         <w:t xml:space="preserve"> </w:t>
       </w:r>
@@ -627,7 +627,7 @@
           <w:rFonts w:ascii="Consolas" w:hAnsi="Consolas" w:eastAsia="Consolas"/>
           <w:b w:val="0"/>
           <w:i w:val="0"/>
-          <w:sz w:val="18"/>
+          <w:sz w:val="22"/>
         </w:rPr>
         <w:t>ALPHABET = 'абвгде'</w:t>
       </w:r>
@@ -643,7 +643,7 @@
           <w:rFonts w:ascii="Consolas" w:hAnsi="Consolas" w:eastAsia="Consolas"/>
           <w:b w:val="0"/>
           <w:i w:val="0"/>
-          <w:sz w:val="18"/>
+          <w:sz w:val="22"/>
         </w:rPr>
         <w:t>BLOCK_SIZE = 2</w:t>
       </w:r>
@@ -659,7 +659,7 @@
           <w:rFonts w:ascii="Consolas" w:hAnsi="Consolas" w:eastAsia="Consolas"/>
           <w:b w:val="0"/>
           <w:i w:val="0"/>
-          <w:sz w:val="18"/>
+          <w:sz w:val="22"/>
         </w:rPr>
         <w:t>BASE = len(ALPHABET)</w:t>
       </w:r>
@@ -675,7 +675,7 @@
           <w:rFonts w:ascii="Consolas" w:hAnsi="Consolas" w:eastAsia="Consolas"/>
           <w:b w:val="0"/>
           <w:i w:val="0"/>
-          <w:sz w:val="18"/>
+          <w:sz w:val="22"/>
         </w:rPr>
         <w:t>MODULUS = BASE ** BLOCK_SIZE  # 36 возможных блоков</w:t>
       </w:r>
@@ -691,7 +691,7 @@
           <w:rFonts w:ascii="Consolas" w:hAnsi="Consolas" w:eastAsia="Consolas"/>
           <w:b w:val="0"/>
           <w:i w:val="0"/>
-          <w:sz w:val="18"/>
+          <w:sz w:val="22"/>
         </w:rPr>
         <w:t>A = 5                          # НОД(5, 36) = 1</w:t>
       </w:r>
@@ -707,7 +707,7 @@
           <w:rFonts w:ascii="Consolas" w:hAnsi="Consolas" w:eastAsia="Consolas"/>
           <w:b w:val="0"/>
           <w:i w:val="0"/>
-          <w:sz w:val="18"/>
+          <w:sz w:val="22"/>
         </w:rPr>
         <w:t>B = 7</w:t>
       </w:r>
@@ -723,7 +723,7 @@
           <w:rFonts w:ascii="Consolas" w:hAnsi="Consolas" w:eastAsia="Consolas"/>
           <w:b w:val="0"/>
           <w:i w:val="0"/>
-          <w:sz w:val="18"/>
+          <w:sz w:val="22"/>
         </w:rPr>
         <w:t>A_INV = pow(A, -1, MODULUS)   # 29</w:t>
       </w:r>
@@ -739,7 +739,7 @@
           <w:rFonts w:ascii="Consolas" w:hAnsi="Consolas" w:eastAsia="Consolas"/>
           <w:b w:val="0"/>
           <w:i w:val="0"/>
-          <w:sz w:val="18"/>
+          <w:sz w:val="22"/>
         </w:rPr>
         <w:t xml:space="preserve"> </w:t>
       </w:r>
@@ -755,7 +755,7 @@
           <w:rFonts w:ascii="Consolas" w:hAnsi="Consolas" w:eastAsia="Consolas"/>
           <w:b w:val="0"/>
           <w:i w:val="0"/>
-          <w:sz w:val="18"/>
+          <w:sz w:val="22"/>
         </w:rPr>
         <w:t xml:space="preserve"> </w:t>
       </w:r>
@@ -771,7 +771,7 @@
           <w:rFonts w:ascii="Consolas" w:hAnsi="Consolas" w:eastAsia="Consolas"/>
           <w:b w:val="0"/>
           <w:i w:val="0"/>
-          <w:sz w:val="18"/>
+          <w:sz w:val="22"/>
         </w:rPr>
         <w:t>def _block_to_number(block: str) -&gt; int:</w:t>
       </w:r>
@@ -787,7 +787,7 @@
           <w:rFonts w:ascii="Consolas" w:hAnsi="Consolas" w:eastAsia="Consolas"/>
           <w:b w:val="0"/>
           <w:i w:val="0"/>
-          <w:sz w:val="18"/>
+          <w:sz w:val="22"/>
         </w:rPr>
         <w:t xml:space="preserve">    value = 0</w:t>
       </w:r>
@@ -803,7 +803,7 @@
           <w:rFonts w:ascii="Consolas" w:hAnsi="Consolas" w:eastAsia="Consolas"/>
           <w:b w:val="0"/>
           <w:i w:val="0"/>
-          <w:sz w:val="18"/>
+          <w:sz w:val="22"/>
         </w:rPr>
         <w:t xml:space="preserve">    for symbol in block:</w:t>
       </w:r>
@@ -819,7 +819,7 @@
           <w:rFonts w:ascii="Consolas" w:hAnsi="Consolas" w:eastAsia="Consolas"/>
           <w:b w:val="0"/>
           <w:i w:val="0"/>
-          <w:sz w:val="18"/>
+          <w:sz w:val="22"/>
         </w:rPr>
         <w:t xml:space="preserve">        value = value * BASE + ALPHABET.index(symbol)</w:t>
       </w:r>
@@ -835,7 +835,7 @@
           <w:rFonts w:ascii="Consolas" w:hAnsi="Consolas" w:eastAsia="Consolas"/>
           <w:b w:val="0"/>
           <w:i w:val="0"/>
-          <w:sz w:val="18"/>
+          <w:sz w:val="22"/>
         </w:rPr>
         <w:t xml:space="preserve">    return value</w:t>
       </w:r>
@@ -851,7 +851,7 @@
           <w:rFonts w:ascii="Consolas" w:hAnsi="Consolas" w:eastAsia="Consolas"/>
           <w:b w:val="0"/>
           <w:i w:val="0"/>
-          <w:sz w:val="18"/>
+          <w:sz w:val="22"/>
         </w:rPr>
         <w:t xml:space="preserve"> </w:t>
       </w:r>
@@ -867,7 +867,7 @@
           <w:rFonts w:ascii="Consolas" w:hAnsi="Consolas" w:eastAsia="Consolas"/>
           <w:b w:val="0"/>
           <w:i w:val="0"/>
-          <w:sz w:val="18"/>
+          <w:sz w:val="22"/>
         </w:rPr>
         <w:t xml:space="preserve"> </w:t>
       </w:r>
@@ -883,7 +883,7 @@
           <w:rFonts w:ascii="Consolas" w:hAnsi="Consolas" w:eastAsia="Consolas"/>
           <w:b w:val="0"/>
           <w:i w:val="0"/>
-          <w:sz w:val="18"/>
+          <w:sz w:val="22"/>
         </w:rPr>
         <w:t>def _number_to_block(value: int) -&gt; str:</w:t>
       </w:r>
@@ -899,7 +899,7 @@
           <w:rFonts w:ascii="Consolas" w:hAnsi="Consolas" w:eastAsia="Consolas"/>
           <w:b w:val="0"/>
           <w:i w:val="0"/>
-          <w:sz w:val="18"/>
+          <w:sz w:val="22"/>
         </w:rPr>
         <w:t xml:space="preserve">    result = []</w:t>
       </w:r>
@@ -915,7 +915,7 @@
           <w:rFonts w:ascii="Consolas" w:hAnsi="Consolas" w:eastAsia="Consolas"/>
           <w:b w:val="0"/>
           <w:i w:val="0"/>
-          <w:sz w:val="18"/>
+          <w:sz w:val="22"/>
         </w:rPr>
         <w:t xml:space="preserve">    for _ in range(BLOCK_SIZE):</w:t>
       </w:r>
@@ -931,7 +931,7 @@
           <w:rFonts w:ascii="Consolas" w:hAnsi="Consolas" w:eastAsia="Consolas"/>
           <w:b w:val="0"/>
           <w:i w:val="0"/>
-          <w:sz w:val="18"/>
+          <w:sz w:val="22"/>
         </w:rPr>
         <w:t xml:space="preserve">        result.append(ALPHABET[value % BASE])</w:t>
       </w:r>
@@ -947,7 +947,7 @@
           <w:rFonts w:ascii="Consolas" w:hAnsi="Consolas" w:eastAsia="Consolas"/>
           <w:b w:val="0"/>
           <w:i w:val="0"/>
-          <w:sz w:val="18"/>
+          <w:sz w:val="22"/>
         </w:rPr>
         <w:t xml:space="preserve">        value //= BASE</w:t>
       </w:r>
@@ -963,7 +963,7 @@
           <w:rFonts w:ascii="Consolas" w:hAnsi="Consolas" w:eastAsia="Consolas"/>
           <w:b w:val="0"/>
           <w:i w:val="0"/>
-          <w:sz w:val="18"/>
+          <w:sz w:val="22"/>
         </w:rPr>
         <w:t xml:space="preserve">    return ''.join(reversed(result))</w:t>
       </w:r>
@@ -979,7 +979,7 @@
           <w:rFonts w:ascii="Consolas" w:hAnsi="Consolas" w:eastAsia="Consolas"/>
           <w:b w:val="0"/>
           <w:i w:val="0"/>
-          <w:sz w:val="18"/>
+          <w:sz w:val="22"/>
         </w:rPr>
         <w:t xml:space="preserve"> </w:t>
       </w:r>
@@ -995,7 +995,7 @@
           <w:rFonts w:ascii="Consolas" w:hAnsi="Consolas" w:eastAsia="Consolas"/>
           <w:b w:val="0"/>
           <w:i w:val="0"/>
-          <w:sz w:val="18"/>
+          <w:sz w:val="22"/>
         </w:rPr>
         <w:t xml:space="preserve"> </w:t>
       </w:r>
@@ -1011,7 +1011,7 @@
           <w:rFonts w:ascii="Consolas" w:hAnsi="Consolas" w:eastAsia="Consolas"/>
           <w:b w:val="0"/>
           <w:i w:val="0"/>
-          <w:sz w:val="18"/>
+          <w:sz w:val="22"/>
         </w:rPr>
         <w:t>def encrypt(text: str) -&gt; Tuple[str, int]:</w:t>
       </w:r>
@@ -1027,7 +1027,7 @@
           <w:rFonts w:ascii="Consolas" w:hAnsi="Consolas" w:eastAsia="Consolas"/>
           <w:b w:val="0"/>
           <w:i w:val="0"/>
-          <w:sz w:val="18"/>
+          <w:sz w:val="22"/>
         </w:rPr>
         <w:t xml:space="preserve">    """Шифрует текст из символов варианта №10."""</w:t>
       </w:r>
@@ -1043,7 +1043,7 @@
           <w:rFonts w:ascii="Consolas" w:hAnsi="Consolas" w:eastAsia="Consolas"/>
           <w:b w:val="0"/>
           <w:i w:val="0"/>
-          <w:sz w:val="18"/>
+          <w:sz w:val="22"/>
         </w:rPr>
         <w:t xml:space="preserve">    if any(symbol not in ALPHABET for symbol in text):</w:t>
       </w:r>
@@ -1059,7 +1059,7 @@
           <w:rFonts w:ascii="Consolas" w:hAnsi="Consolas" w:eastAsia="Consolas"/>
           <w:b w:val="0"/>
           <w:i w:val="0"/>
-          <w:sz w:val="18"/>
+          <w:sz w:val="22"/>
         </w:rPr>
         <w:t xml:space="preserve">        raise ValueError('Разрешены только символы: ' + ALPHABET)</w:t>
       </w:r>
@@ -1075,7 +1075,7 @@
           <w:rFonts w:ascii="Consolas" w:hAnsi="Consolas" w:eastAsia="Consolas"/>
           <w:b w:val="0"/>
           <w:i w:val="0"/>
-          <w:sz w:val="18"/>
+          <w:sz w:val="22"/>
         </w:rPr>
         <w:t xml:space="preserve">    original_length = len(text)</w:t>
       </w:r>
@@ -1091,7 +1091,7 @@
           <w:rFonts w:ascii="Consolas" w:hAnsi="Consolas" w:eastAsia="Consolas"/>
           <w:b w:val="0"/>
           <w:i w:val="0"/>
-          <w:sz w:val="18"/>
+          <w:sz w:val="22"/>
         </w:rPr>
         <w:t xml:space="preserve">    padded = text + ALPHABET[0] * ((BLOCK_SIZE - len(text) % BLOCK_SIZE) % BLOCK_SIZE)</w:t>
       </w:r>
@@ -1107,7 +1107,7 @@
           <w:rFonts w:ascii="Consolas" w:hAnsi="Consolas" w:eastAsia="Consolas"/>
           <w:b w:val="0"/>
           <w:i w:val="0"/>
-          <w:sz w:val="18"/>
+          <w:sz w:val="22"/>
         </w:rPr>
         <w:t xml:space="preserve">    result = []</w:t>
       </w:r>
@@ -1123,7 +1123,7 @@
           <w:rFonts w:ascii="Consolas" w:hAnsi="Consolas" w:eastAsia="Consolas"/>
           <w:b w:val="0"/>
           <w:i w:val="0"/>
-          <w:sz w:val="18"/>
+          <w:sz w:val="22"/>
         </w:rPr>
         <w:t xml:space="preserve">    for i in range(0, len(padded), BLOCK_SIZE):</w:t>
       </w:r>
@@ -1139,7 +1139,7 @@
           <w:rFonts w:ascii="Consolas" w:hAnsi="Consolas" w:eastAsia="Consolas"/>
           <w:b w:val="0"/>
           <w:i w:val="0"/>
-          <w:sz w:val="18"/>
+          <w:sz w:val="22"/>
         </w:rPr>
         <w:t xml:space="preserve">        number = _block_to_number(padded[i:i + BLOCK_SIZE])</w:t>
       </w:r>
@@ -1155,7 +1155,7 @@
           <w:rFonts w:ascii="Consolas" w:hAnsi="Consolas" w:eastAsia="Consolas"/>
           <w:b w:val="0"/>
           <w:i w:val="0"/>
-          <w:sz w:val="18"/>
+          <w:sz w:val="22"/>
         </w:rPr>
         <w:t xml:space="preserve">        result.append(_number_to_block((A * number + B) % MODULUS))</w:t>
       </w:r>
@@ -1171,7 +1171,7 @@
           <w:rFonts w:ascii="Consolas" w:hAnsi="Consolas" w:eastAsia="Consolas"/>
           <w:b w:val="0"/>
           <w:i w:val="0"/>
-          <w:sz w:val="18"/>
+          <w:sz w:val="22"/>
         </w:rPr>
         <w:t xml:space="preserve">    return ''.join(result), original_length</w:t>
       </w:r>
@@ -1187,7 +1187,7 @@
           <w:rFonts w:ascii="Consolas" w:hAnsi="Consolas" w:eastAsia="Consolas"/>
           <w:b w:val="0"/>
           <w:i w:val="0"/>
-          <w:sz w:val="18"/>
+          <w:sz w:val="22"/>
         </w:rPr>
         <w:t xml:space="preserve"> </w:t>
       </w:r>
@@ -1203,7 +1203,7 @@
           <w:rFonts w:ascii="Consolas" w:hAnsi="Consolas" w:eastAsia="Consolas"/>
           <w:b w:val="0"/>
           <w:i w:val="0"/>
-          <w:sz w:val="18"/>
+          <w:sz w:val="22"/>
         </w:rPr>
         <w:t xml:space="preserve"> </w:t>
       </w:r>
@@ -1219,7 +1219,7 @@
           <w:rFonts w:ascii="Consolas" w:hAnsi="Consolas" w:eastAsia="Consolas"/>
           <w:b w:val="0"/>
           <w:i w:val="0"/>
-          <w:sz w:val="18"/>
+          <w:sz w:val="22"/>
         </w:rPr>
         <w:t>def decrypt(ciphertext: str, original_length: int) -&gt; str:</w:t>
       </w:r>
@@ -1235,7 +1235,7 @@
           <w:rFonts w:ascii="Consolas" w:hAnsi="Consolas" w:eastAsia="Consolas"/>
           <w:b w:val="0"/>
           <w:i w:val="0"/>
-          <w:sz w:val="18"/>
+          <w:sz w:val="22"/>
         </w:rPr>
         <w:t xml:space="preserve">    if len(ciphertext) % BLOCK_SIZE:</w:t>
       </w:r>
@@ -1251,7 +1251,7 @@
           <w:rFonts w:ascii="Consolas" w:hAnsi="Consolas" w:eastAsia="Consolas"/>
           <w:b w:val="0"/>
           <w:i w:val="0"/>
-          <w:sz w:val="18"/>
+          <w:sz w:val="22"/>
         </w:rPr>
         <w:t xml:space="preserve">        raise ValueError('Длина шифртекста должна быть кратна 2')</w:t>
       </w:r>
@@ -1267,7 +1267,7 @@
           <w:rFonts w:ascii="Consolas" w:hAnsi="Consolas" w:eastAsia="Consolas"/>
           <w:b w:val="0"/>
           <w:i w:val="0"/>
-          <w:sz w:val="18"/>
+          <w:sz w:val="22"/>
         </w:rPr>
         <w:t xml:space="preserve">    result = []</w:t>
       </w:r>
@@ -1283,7 +1283,7 @@
           <w:rFonts w:ascii="Consolas" w:hAnsi="Consolas" w:eastAsia="Consolas"/>
           <w:b w:val="0"/>
           <w:i w:val="0"/>
-          <w:sz w:val="18"/>
+          <w:sz w:val="22"/>
         </w:rPr>
         <w:t xml:space="preserve">    for i in range(0, len(ciphertext), BLOCK_SIZE):</w:t>
       </w:r>
@@ -1299,7 +1299,7 @@
           <w:rFonts w:ascii="Consolas" w:hAnsi="Consolas" w:eastAsia="Consolas"/>
           <w:b w:val="0"/>
           <w:i w:val="0"/>
-          <w:sz w:val="18"/>
+          <w:sz w:val="22"/>
         </w:rPr>
         <w:t xml:space="preserve">        number = _block_to_number(ciphertext[i:i + BLOCK_SIZE])</w:t>
       </w:r>
@@ -1315,7 +1315,7 @@
           <w:rFonts w:ascii="Consolas" w:hAnsi="Consolas" w:eastAsia="Consolas"/>
           <w:b w:val="0"/>
           <w:i w:val="0"/>
-          <w:sz w:val="18"/>
+          <w:sz w:val="22"/>
         </w:rPr>
         <w:t xml:space="preserve">        plain_number = (A_INV * (number - B)) % MODULUS</w:t>
       </w:r>
@@ -1331,7 +1331,7 @@
           <w:rFonts w:ascii="Consolas" w:hAnsi="Consolas" w:eastAsia="Consolas"/>
           <w:b w:val="0"/>
           <w:i w:val="0"/>
-          <w:sz w:val="18"/>
+          <w:sz w:val="22"/>
         </w:rPr>
         <w:t xml:space="preserve">        result.append(_number_to_block(plain_number))</w:t>
       </w:r>
@@ -1347,7 +1347,7 @@
           <w:rFonts w:ascii="Consolas" w:hAnsi="Consolas" w:eastAsia="Consolas"/>
           <w:b w:val="0"/>
           <w:i w:val="0"/>
-          <w:sz w:val="18"/>
+          <w:sz w:val="22"/>
         </w:rPr>
         <w:t xml:space="preserve">    return ''.join(result)[:original_length]</w:t>
       </w:r>
@@ -1363,7 +1363,7 @@
           <w:rFonts w:ascii="Consolas" w:hAnsi="Consolas" w:eastAsia="Consolas"/>
           <w:b w:val="0"/>
           <w:i w:val="0"/>
-          <w:sz w:val="18"/>
+          <w:sz w:val="22"/>
         </w:rPr>
         <w:t xml:space="preserve"> </w:t>
       </w:r>
@@ -1379,7 +1379,7 @@
           <w:rFonts w:ascii="Consolas" w:hAnsi="Consolas" w:eastAsia="Consolas"/>
           <w:b w:val="0"/>
           <w:i w:val="0"/>
-          <w:sz w:val="18"/>
+          <w:sz w:val="22"/>
         </w:rPr>
         <w:t xml:space="preserve"> </w:t>
       </w:r>
@@ -1395,7 +1395,7 @@
           <w:rFonts w:ascii="Consolas" w:hAnsi="Consolas" w:eastAsia="Consolas"/>
           <w:b w:val="0"/>
           <w:i w:val="0"/>
-          <w:sz w:val="18"/>
+          <w:sz w:val="22"/>
         </w:rPr>
         <w:t>if __name__ == '__main__':</w:t>
       </w:r>
@@ -1411,7 +1411,7 @@
           <w:rFonts w:ascii="Consolas" w:hAnsi="Consolas" w:eastAsia="Consolas"/>
           <w:b w:val="0"/>
           <w:i w:val="0"/>
-          <w:sz w:val="18"/>
+          <w:sz w:val="22"/>
         </w:rPr>
         <w:t xml:space="preserve">    source = input('Открытый текст (символы абвгде): ')</w:t>
       </w:r>
@@ -1427,7 +1427,7 @@
           <w:rFonts w:ascii="Consolas" w:hAnsi="Consolas" w:eastAsia="Consolas"/>
           <w:b w:val="0"/>
           <w:i w:val="0"/>
-          <w:sz w:val="18"/>
+          <w:sz w:val="22"/>
         </w:rPr>
         <w:t xml:space="preserve">    encrypted, length = encrypt(source)</w:t>
       </w:r>
@@ -1443,7 +1443,7 @@
           <w:rFonts w:ascii="Consolas" w:hAnsi="Consolas" w:eastAsia="Consolas"/>
           <w:b w:val="0"/>
           <w:i w:val="0"/>
-          <w:sz w:val="18"/>
+          <w:sz w:val="22"/>
         </w:rPr>
         <w:t xml:space="preserve">    print('Шифрограмма:', encrypted)</w:t>
       </w:r>
@@ -1459,7 +1459,7 @@
           <w:rFonts w:ascii="Consolas" w:hAnsi="Consolas" w:eastAsia="Consolas"/>
           <w:b w:val="0"/>
           <w:i w:val="0"/>
-          <w:sz w:val="18"/>
+          <w:sz w:val="22"/>
         </w:rPr>
         <w:t xml:space="preserve">    print('Расшифрование:', decrypt(encrypted, length))</w:t>
       </w:r>
@@ -1475,7 +1475,7 @@
           <w:rFonts w:ascii="Times New Roman" w:hAnsi="Times New Roman" w:eastAsia="Times New Roman"/>
           <w:b/>
           <w:i w:val="0"/>
-          <w:sz w:val="26"/>
+          <w:sz w:val="28"/>
         </w:rPr>
         <w:t>Полное объяснение программы</w:t>
       </w:r>
@@ -1491,7 +1491,7 @@
           <w:rFonts w:ascii="Times New Roman" w:hAnsi="Times New Roman" w:eastAsia="Times New Roman"/>
           <w:b w:val="0"/>
           <w:i w:val="0"/>
-          <w:sz w:val="26"/>
+          <w:sz w:val="28"/>
         </w:rPr>
         <w:t>Константа ALPHABET задаёт порядок символов варианта. Этот порядок важен: индекс символа в строке используется как его числовое значение от 0 до 5. BLOCK_SIZE равен двум, BASE равен шести, а MODULUS вычисляется как 6² и задаёт количество возможных блоков.</w:t>
       </w:r>
@@ -1507,7 +1507,7 @@
           <w:rFonts w:ascii="Times New Roman" w:hAnsi="Times New Roman" w:eastAsia="Times New Roman"/>
           <w:b w:val="0"/>
           <w:i w:val="0"/>
-          <w:sz w:val="26"/>
+          <w:sz w:val="28"/>
         </w:rPr>
         <w:t>Функция _block_to_number переводит пару символов в число по основанию 6. Сначала накапливается значение первого символа, затем оно умножается на 6 и к нему прибавляется индекс второго символа. Обратная функция _number_to_block выполняет деление числа на 6 с остатком и получает два индекса; разворот списка восстанавливает правильный порядок символов.</w:t>
       </w:r>
@@ -1523,7 +1523,7 @@
           <w:rFonts w:ascii="Times New Roman" w:hAnsi="Times New Roman" w:eastAsia="Times New Roman"/>
           <w:b w:val="0"/>
           <w:i w:val="0"/>
-          <w:sz w:val="26"/>
+          <w:sz w:val="28"/>
         </w:rPr>
         <w:t>Функция encrypt сначала проверяет каждый входной символ. Это предотвращает неоднозначность, потому что символы вне алфавита не имеют индекса в таблице подстановки. Затем вычисляется исходная длина, добавляется необходимое число символов «а», а каждый блок переводится в число x и преобразуется по формуле (5x + 7) mod 36.</w:t>
       </w:r>
@@ -1539,7 +1539,7 @@
           <w:rFonts w:ascii="Times New Roman" w:hAnsi="Times New Roman" w:eastAsia="Times New Roman"/>
           <w:b w:val="0"/>
           <w:i w:val="0"/>
-          <w:sz w:val="26"/>
+          <w:sz w:val="28"/>
         </w:rPr>
         <w:t>Функция decrypt принимает шифртекст и исходную длину. Для каждого блока она получает число y, вычитает свободный член 7 и умножает результат на обратный множитель 29 по модулю 36. После обратного преобразования пары объединяются, а срез [:original_length] удаляет только символы заполнения, не затрагивая реальные символы исходного текста.</w:t>
       </w:r>
@@ -1555,7 +1555,7 @@
           <w:rFonts w:ascii="Times New Roman" w:hAnsi="Times New Roman" w:eastAsia="Times New Roman"/>
           <w:b w:val="0"/>
           <w:i w:val="0"/>
-          <w:sz w:val="26"/>
+          <w:sz w:val="28"/>
         </w:rPr>
         <w:t>В блоке if __name__ == '__main__' программа запрашивает сообщение, вызывает encrypt, выводит шифрограмму, а затем немедленно выполняет decrypt. Такая проверка показывает, что выбранная функция действительно обратима и что весь цикл обработки данных работает последовательно.</w:t>
       </w:r>
@@ -1571,7 +1571,7 @@
           <w:rFonts w:ascii="Times New Roman" w:hAnsi="Times New Roman" w:eastAsia="Times New Roman"/>
           <w:b/>
           <w:i w:val="0"/>
-          <w:sz w:val="26"/>
+          <w:sz w:val="28"/>
         </w:rPr>
         <w:t>5. Пример открытого текста и соответствующей шифрограммы</w:t>
       </w:r>
@@ -1587,7 +1587,7 @@
           <w:rFonts w:ascii="Times New Roman" w:hAnsi="Times New Roman" w:eastAsia="Times New Roman"/>
           <w:b w:val="0"/>
           <w:i w:val="0"/>
-          <w:sz w:val="26"/>
+          <w:sz w:val="28"/>
         </w:rPr>
         <w:t>Открытый текст: «абвгдеаб». Длина исходного текста: 8 символов.</w:t>
       </w:r>
@@ -1603,7 +1603,7 @@
           <w:rFonts w:ascii="Times New Roman" w:hAnsi="Times New Roman" w:eastAsia="Times New Roman"/>
           <w:b w:val="0"/>
           <w:i w:val="0"/>
-          <w:sz w:val="26"/>
+          <w:sz w:val="28"/>
         </w:rPr>
         <w:t>Шифрограмма: вабдбвва</w:t>
       </w:r>
@@ -1619,7 +1619,7 @@
           <w:rFonts w:ascii="Times New Roman" w:hAnsi="Times New Roman" w:eastAsia="Times New Roman"/>
           <w:b w:val="0"/>
           <w:i w:val="0"/>
-          <w:sz w:val="26"/>
+          <w:sz w:val="28"/>
         </w:rPr>
         <w:t>Результат дешифрования: «абвгдеаб». Совпадение с исходным текстом подтверждает корректность обратной функции.</w:t>
       </w:r>
@@ -1635,7 +1635,7 @@
           <w:rFonts w:ascii="Times New Roman" w:hAnsi="Times New Roman" w:eastAsia="Times New Roman"/>
           <w:b/>
           <w:i w:val="0"/>
-          <w:sz w:val="26"/>
+          <w:sz w:val="28"/>
         </w:rPr>
         <w:t>6. Выводы по работе</w:t>
       </w:r>
@@ -1651,7 +1651,7 @@
           <w:rFonts w:ascii="Times New Roman" w:hAnsi="Times New Roman" w:eastAsia="Times New Roman"/>
           <w:b w:val="0"/>
           <w:i w:val="0"/>
-          <w:sz w:val="26"/>
+          <w:sz w:val="28"/>
         </w:rPr>
         <w:t>В работе реализовано блочное подстановочное шифрование для алфавита из шести символов и блока длиной два символа. Выбранная линейная функция является взаимно однозначной, поэтому зашифрованный текст однозначно восстанавливается при наличии параметров A, B и длины исходных данных.</w:t>
       </w:r>
@@ -2036,7 +2036,7 @@
     </w:pPr>
     <w:rPr>
       <w:rFonts w:ascii="Times New Roman" w:hAnsi="Times New Roman" w:eastAsia="Times New Roman"/>
-      <w:sz w:val="26"/>
+      <w:sz w:val="28"/>
     </w:rPr>
   </w:style>
   <w:style w:type="paragraph" w:styleId="Header">

</xml_diff>

<commit_message>
Remove code comments and expand report content
</commit_message>
<xml_diff>
--- a/З_И/Лабораторная_работа_1_Подстановка.docx
+++ b/З_И/Лабораторная_работа_1_Подстановка.docx
@@ -104,8 +104,6 @@
         <w:t>Выполнил(а): студент(ка) группы __________</w:t>
         <w:br/>
         <w:t>Ф. И. О.: ______________________________</w:t>
-        <w:br/>
-        <w:t>Вариант: №10</w:t>
       </w:r>
     </w:p>
     <w:p>
@@ -268,7 +266,7 @@
           <w:i w:val="0"/>
           <w:sz w:val="28"/>
         </w:rPr>
-        <w:t>В варианте №10 алфавит содержит шесть символов. Поэтому двухсимвольный блок можно рассматривать как число в диапазоне от 0 до 35: первый символ задаёт разряд шестёрок, второй — разряд единиц. Всего существует 6² = 36 комбинаций, и функция CV должна переставлять все эти комбинации без повторений и пропусков.</w:t>
+        <w:t>При таком алфавите содержит шесть символов. Поэтому двухсимвольный блок можно рассматривать как число в диапазоне от 0 до 35: первый символ задаёт разряд шестёрок, второй — разряд единиц. Всего существует 6² = 36 комбинаций, и функция CV должна переставлять все эти комбинации без повторений и пропусков.</w:t>
       </w:r>
     </w:p>
     <w:p>
@@ -316,7 +314,7 @@
           <w:i w:val="0"/>
           <w:sz w:val="28"/>
         </w:rPr>
-        <w:t>Текст варианта состоит из символов алфавита V = {а, б, в, г, д, е} и разбивается на блоки по два символа. Пара символов кодируется числом x от 0 до 35 в системе счисления по основанию 6. Затем вычисляется y = (5x + 7) mod 36, а число y снова представляется парой символов. Для дешифрования используется обратная функция x = 29(y − 7) mod 36. Неполный последний блок дополняется символом «а», а исходная длина сохраняется отдельно.</w:t>
+        <w:t>Исходный текст состоит из символов алфавита V = {а, б, в, г, д, е} и разбивается на блоки по два символа. Пара символов кодируется числом x от 0 до 35 в системе счисления по основанию 6. Затем вычисляется y = (5x + 7) mod 36, а число y снова представляется парой символов. Для дешифрования используется обратная функция x = 29(y − 7) mod 36. Неполный последний блок дополняется символом «а», а исходная длина сохраняется отдельно.</w:t>
       </w:r>
     </w:p>
     <w:tbl>
@@ -677,7 +675,7 @@
           <w:i w:val="0"/>
           <w:sz w:val="22"/>
         </w:rPr>
-        <w:t>MODULUS = BASE ** BLOCK_SIZE  # 36 возможных блоков</w:t>
+        <w:t>MODULUS = BASE ** BLOCK_SIZE</w:t>
       </w:r>
     </w:p>
     <w:p>
@@ -693,7 +691,7 @@
           <w:i w:val="0"/>
           <w:sz w:val="22"/>
         </w:rPr>
-        <w:t>A = 5                          # НОД(5, 36) = 1</w:t>
+        <w:t>A = 5</w:t>
       </w:r>
     </w:p>
     <w:p>
@@ -725,7 +723,7 @@
           <w:i w:val="0"/>
           <w:sz w:val="22"/>
         </w:rPr>
-        <w:t>A_INV = pow(A, -1, MODULUS)   # 29</w:t>
+        <w:t>A_INV = pow(A, -1, MODULUS)</w:t>
       </w:r>
     </w:p>
     <w:p>
@@ -1014,22 +1012,6 @@
           <w:sz w:val="22"/>
         </w:rPr>
         <w:t>def encrypt(text: str) -&gt; Tuple[str, int]:</w:t>
-      </w:r>
-    </w:p>
-    <w:p>
-      <w:pPr>
-        <w:spacing w:line="240" w:lineRule="auto" w:after="0"/>
-        <w:ind w:left="181" w:firstLine="0"/>
-        <w:jc w:val="left"/>
-      </w:pPr>
-      <w:r>
-        <w:rPr>
-          <w:rFonts w:ascii="Consolas" w:hAnsi="Consolas" w:eastAsia="Consolas"/>
-          <w:b w:val="0"/>
-          <w:i w:val="0"/>
-          <w:sz w:val="22"/>
-        </w:rPr>
-        <w:t xml:space="preserve">    """Шифрует текст из символов варианта №10."""</w:t>
       </w:r>
     </w:p>
     <w:p>
@@ -1493,7 +1475,7 @@
           <w:i w:val="0"/>
           <w:sz w:val="28"/>
         </w:rPr>
-        <w:t>Константа ALPHABET задаёт порядок символов варианта. Этот порядок важен: индекс символа в строке используется как его числовое значение от 0 до 5. BLOCK_SIZE равен двум, BASE равен шести, а MODULUS вычисляется как 6² и задаёт количество возможных блоков.</w:t>
+        <w:t>Константа ALPHABET задаёт порядок символов алфавита. Этот порядок важен: индекс символа в строке используется как его числовое значение от 0 до 5. BLOCK_SIZE равен двум, BASE равен шести, а MODULUS вычисляется как 6² и задаёт количество возможных блоков.</w:t>
       </w:r>
     </w:p>
     <w:p>
@@ -1558,6 +1540,155 @@
           <w:sz w:val="28"/>
         </w:rPr>
         <w:t>В блоке if __name__ == '__main__' программа запрашивает сообщение, вызывает encrypt, выводит шифрограмму, а затем немедленно выполняет decrypt. Такая проверка показывает, что выбранная функция действительно обратима и что весь цикл обработки данных работает последовательно.</w:t>
+      </w:r>
+    </w:p>
+    <w:p>
+      <w:pPr>
+        <w:keepNext/>
+        <w:spacing w:line="360" w:lineRule="auto" w:before="80" w:after="80"/>
+        <w:jc w:val="left"/>
+      </w:pPr>
+      <w:r>
+        <w:rPr>
+          <w:rFonts w:ascii="Times New Roman" w:hAnsi="Times New Roman" w:eastAsia="Times New Roman"/>
+          <w:b/>
+          <w:i w:val="0"/>
+          <w:sz w:val="28"/>
+        </w:rPr>
+        <w:t>Алгоритм выполнения</w:t>
+      </w:r>
+    </w:p>
+    <w:p>
+      <w:pPr>
+        <w:pStyle w:val="ListBullet"/>
+        <w:spacing w:line="360" w:lineRule="auto"/>
+        <w:ind w:left="709" w:hanging="283"/>
+        <w:jc w:val="both"/>
+      </w:pPr>
+      <w:r>
+        <w:rPr>
+          <w:rFonts w:ascii="Times New Roman" w:hAnsi="Times New Roman" w:eastAsia="Times New Roman"/>
+          <w:b w:val="0"/>
+          <w:i w:val="0"/>
+          <w:sz w:val="28"/>
+        </w:rPr>
+        <w:t>Проверить, что все символы исходного сообщения входят в заданный алфавит.</w:t>
+      </w:r>
+    </w:p>
+    <w:p>
+      <w:pPr>
+        <w:pStyle w:val="ListBullet"/>
+        <w:spacing w:line="360" w:lineRule="auto"/>
+        <w:ind w:left="709" w:hanging="283"/>
+        <w:jc w:val="both"/>
+      </w:pPr>
+      <w:r>
+        <w:rPr>
+          <w:rFonts w:ascii="Times New Roman" w:hAnsi="Times New Roman" w:eastAsia="Times New Roman"/>
+          <w:b w:val="0"/>
+          <w:i w:val="0"/>
+          <w:sz w:val="28"/>
+        </w:rPr>
+        <w:t>Дополнить сообщение символом «а», если количество символов нечётное, и сохранить исходную длину.</w:t>
+      </w:r>
+    </w:p>
+    <w:p>
+      <w:pPr>
+        <w:pStyle w:val="ListBullet"/>
+        <w:spacing w:line="360" w:lineRule="auto"/>
+        <w:ind w:left="709" w:hanging="283"/>
+        <w:jc w:val="both"/>
+      </w:pPr>
+      <w:r>
+        <w:rPr>
+          <w:rFonts w:ascii="Times New Roman" w:hAnsi="Times New Roman" w:eastAsia="Times New Roman"/>
+          <w:b w:val="0"/>
+          <w:i w:val="0"/>
+          <w:sz w:val="28"/>
+        </w:rPr>
+        <w:t>Перевести каждую пару символов в число от 0 до 35.</w:t>
+      </w:r>
+    </w:p>
+    <w:p>
+      <w:pPr>
+        <w:pStyle w:val="ListBullet"/>
+        <w:spacing w:line="360" w:lineRule="auto"/>
+        <w:ind w:left="709" w:hanging="283"/>
+        <w:jc w:val="both"/>
+      </w:pPr>
+      <w:r>
+        <w:rPr>
+          <w:rFonts w:ascii="Times New Roman" w:hAnsi="Times New Roman" w:eastAsia="Times New Roman"/>
+          <w:b w:val="0"/>
+          <w:i w:val="0"/>
+          <w:sz w:val="28"/>
+        </w:rPr>
+        <w:t>Вычислить значение CV(x) = (5x + 7) mod 36 и преобразовать результат обратно в пару символов.</w:t>
+      </w:r>
+    </w:p>
+    <w:p>
+      <w:pPr>
+        <w:pStyle w:val="ListBullet"/>
+        <w:spacing w:line="360" w:lineRule="auto"/>
+        <w:ind w:left="709" w:hanging="283"/>
+        <w:jc w:val="both"/>
+      </w:pPr>
+      <w:r>
+        <w:rPr>
+          <w:rFonts w:ascii="Times New Roman" w:hAnsi="Times New Roman" w:eastAsia="Times New Roman"/>
+          <w:b w:val="0"/>
+          <w:i w:val="0"/>
+          <w:sz w:val="28"/>
+        </w:rPr>
+        <w:t>Для проверки применить обратную формулу, удалить только заполнение и сравнить строку с исходным сообщением.</w:t>
+      </w:r>
+    </w:p>
+    <w:p>
+      <w:pPr>
+        <w:keepNext/>
+        <w:spacing w:line="360" w:lineRule="auto" w:before="80" w:after="80"/>
+        <w:jc w:val="left"/>
+      </w:pPr>
+      <w:r>
+        <w:rPr>
+          <w:rFonts w:ascii="Times New Roman" w:hAnsi="Times New Roman" w:eastAsia="Times New Roman"/>
+          <w:b/>
+          <w:i w:val="0"/>
+          <w:sz w:val="28"/>
+        </w:rPr>
+        <w:t>Анализ результата</w:t>
+      </w:r>
+    </w:p>
+    <w:p>
+      <w:pPr>
+        <w:spacing w:line="360" w:lineRule="auto" w:after="0"/>
+        <w:ind w:firstLine="709"/>
+        <w:jc w:val="both"/>
+      </w:pPr>
+      <w:r>
+        <w:rPr>
+          <w:rFonts w:ascii="Times New Roman" w:hAnsi="Times New Roman" w:eastAsia="Times New Roman"/>
+          <w:b w:val="0"/>
+          <w:i w:val="0"/>
+          <w:sz w:val="28"/>
+        </w:rPr>
+        <w:t>Взаимная однозначность преобразования подтверждается тем, что каждый из 36 входных блоков имеет ровно один выходной блок, а обратный множитель восстанавливает исходное число. При изменении одного блока меняется только соответствующий блок шифртекста, что является свойством блочного метода.</w:t>
+      </w:r>
+    </w:p>
+    <w:p>
+      <w:pPr>
+        <w:spacing w:line="360" w:lineRule="auto" w:after="0"/>
+        <w:ind w:firstLine="709"/>
+        <w:jc w:val="both"/>
+      </w:pPr>
+      <w:r>
+        <w:rPr>
+          <w:rFonts w:ascii="Times New Roman" w:hAnsi="Times New Roman" w:eastAsia="Times New Roman"/>
+          <w:b w:val="0"/>
+          <w:i w:val="0"/>
+          <w:sz w:val="28"/>
+        </w:rPr>
+        <w:t>Аффинная подстановка сохраняет длину сообщения и скрывает непосредственное значение символов, но не обладает стойкостью современных шифров. При небольшом алфавите полный перебор таблицы соответствий возможен быстро, поэтому метод используется для изучения принципа подстановки, а не для защиты реальных данных.</w:t>
       </w:r>
     </w:p>
     <w:p>

</xml_diff>